<commit_message>
Mit Kaggle Datenbank verbunden
</commit_message>
<xml_diff>
--- a/Stunden.docx
+++ b/Stunden.docx
@@ -7,7 +7,7 @@
         <w:t>Total : 1</w:t>
       </w:r>
       <w:r>
-        <w:t>4</w:t>
+        <w:t>8</w:t>
       </w:r>
       <w:r>
         <w:t xml:space="preserve"> Std 0 Min</w:t>
@@ -16,7 +16,19 @@
     <w:p/>
     <w:p>
       <w:r>
-        <w:t>10.09.2026 - 17:00 bis 22:00 - 5 Std 0 Min</w:t>
+        <w:t xml:space="preserve">10.09.2026 </w:t>
+      </w:r>
+      <w:r>
+        <w:t>–</w:t>
+      </w:r>
+      <w:r>
+        <w:t xml:space="preserve"> 17:00 bis 22:00 </w:t>
+      </w:r>
+      <w:r>
+        <w:t>–</w:t>
+      </w:r>
+      <w:r>
+        <w:t xml:space="preserve"> 5 Std 0 Min</w:t>
       </w:r>
     </w:p>
     <w:p>
@@ -28,7 +40,13 @@
         </w:numPr>
       </w:pPr>
       <w:r>
-        <w:t>Computer Vision Pipeline - M2</w:t>
+        <w:t xml:space="preserve">Computer Vision Pipeline </w:t>
+      </w:r>
+      <w:r>
+        <w:t>–</w:t>
+      </w:r>
+      <w:r>
+        <w:t xml:space="preserve"> M2</w:t>
       </w:r>
     </w:p>
     <w:p>
@@ -40,12 +58,30 @@
         </w:numPr>
       </w:pPr>
       <w:r>
-        <w:t>Script fur Bildmessungen in CSV-Export</w:t>
-      </w:r>
-    </w:p>
-    <w:p>
-      <w:r>
-        <w:t>13.09.2026 - 15:30 bis 17:30 - 2 Std 0 Min</w:t>
+        <w:t>Script fur Bildmessungen in CSV</w:t>
+      </w:r>
+      <w:r>
+        <w:t>–</w:t>
+      </w:r>
+      <w:r>
+        <w:t>Export</w:t>
+      </w:r>
+    </w:p>
+    <w:p>
+      <w:r>
+        <w:t xml:space="preserve">13.09.2026 </w:t>
+      </w:r>
+      <w:r>
+        <w:t>–</w:t>
+      </w:r>
+      <w:r>
+        <w:t xml:space="preserve"> 15:30 bis 17:30 </w:t>
+      </w:r>
+      <w:r>
+        <w:t>–</w:t>
+      </w:r>
+      <w:r>
+        <w:t xml:space="preserve"> 2 Std 0 Min</w:t>
       </w:r>
     </w:p>
     <w:p>
@@ -57,7 +93,13 @@
         </w:numPr>
       </w:pPr>
       <w:r>
-        <w:t>Bilderfassungssystem - M1</w:t>
+        <w:t xml:space="preserve">Bilderfassungssystem </w:t>
+      </w:r>
+      <w:r>
+        <w:t>–</w:t>
+      </w:r>
+      <w:r>
+        <w:t xml:space="preserve"> M1</w:t>
       </w:r>
     </w:p>
     <w:p>
@@ -74,7 +116,19 @@
     </w:p>
     <w:p>
       <w:r>
-        <w:t>14.09.2026 - 18:00 bis 20:00 - 2 Std 0 Min</w:t>
+        <w:t xml:space="preserve">14.09.2026 </w:t>
+      </w:r>
+      <w:r>
+        <w:t>–</w:t>
+      </w:r>
+      <w:r>
+        <w:t xml:space="preserve"> 18:00 bis 20:00 </w:t>
+      </w:r>
+      <w:r>
+        <w:t>–</w:t>
+      </w:r>
+      <w:r>
+        <w:t xml:space="preserve"> 2 Std 0 Min</w:t>
       </w:r>
     </w:p>
     <w:p>
@@ -86,7 +140,13 @@
         </w:numPr>
       </w:pPr>
       <w:r>
-        <w:t>Bilderfassungssystem - M1</w:t>
+        <w:t xml:space="preserve">Bilderfassungssystem </w:t>
+      </w:r>
+      <w:r>
+        <w:t>–</w:t>
+      </w:r>
+      <w:r>
+        <w:t xml:space="preserve"> M1</w:t>
       </w:r>
     </w:p>
     <w:p>
@@ -98,12 +158,30 @@
         </w:numPr>
       </w:pPr>
       <w:r>
-        <w:t>Reale Bilder mit Python-Skript verbunden</w:t>
-      </w:r>
-    </w:p>
-    <w:p>
-      <w:r>
-        <w:t>18.09.2026 - 15:00 bis 17:00 - 2 Std 0 Min</w:t>
+        <w:t>Reale Bilder mit Python</w:t>
+      </w:r>
+      <w:r>
+        <w:t>–</w:t>
+      </w:r>
+      <w:r>
+        <w:t>Skript verbunden</w:t>
+      </w:r>
+    </w:p>
+    <w:p>
+      <w:r>
+        <w:t xml:space="preserve">18.09.2026 </w:t>
+      </w:r>
+      <w:r>
+        <w:t>–</w:t>
+      </w:r>
+      <w:r>
+        <w:t xml:space="preserve"> 15:00 bis 17:00 </w:t>
+      </w:r>
+      <w:r>
+        <w:t>–</w:t>
+      </w:r>
+      <w:r>
+        <w:t xml:space="preserve"> 2 Std 0 Min</w:t>
       </w:r>
     </w:p>
     <w:p>
@@ -115,7 +193,13 @@
         </w:numPr>
       </w:pPr>
       <w:r>
-        <w:t>Gesundheitssystem - M3</w:t>
+        <w:t xml:space="preserve">Gesundheitssystem </w:t>
+      </w:r>
+      <w:r>
+        <w:t>–</w:t>
+      </w:r>
+      <w:r>
+        <w:t xml:space="preserve"> M3</w:t>
       </w:r>
     </w:p>
     <w:p>
@@ -127,7 +211,13 @@
         </w:numPr>
       </w:pPr>
       <w:r>
-        <w:t>Erste Draft der Python-Skript</w:t>
+        <w:t>Erste Draft der Python</w:t>
+      </w:r>
+      <w:r>
+        <w:t>–</w:t>
+      </w:r>
+      <w:r>
+        <w:t>Skript</w:t>
       </w:r>
     </w:p>
     <w:p>
@@ -135,13 +225,16 @@
         <w:t xml:space="preserve">21.09.2026 </w:t>
       </w:r>
       <w:r>
-        <w:t xml:space="preserve">- </w:t>
+        <w:t>–</w:t>
+      </w:r>
+      <w:r>
+        <w:t xml:space="preserve"> </w:t>
       </w:r>
       <w:r>
         <w:t xml:space="preserve">19:00 bis 20:00 </w:t>
       </w:r>
       <w:r>
-        <w:t>-</w:t>
+        <w:t>–</w:t>
       </w:r>
       <w:r>
         <w:t xml:space="preserve"> 1 Std 0 Min</w:t>
@@ -156,7 +249,13 @@
         </w:numPr>
       </w:pPr>
       <w:r>
-        <w:t>Computer Vision Pipeline - M2</w:t>
+        <w:t xml:space="preserve">Computer Vision Pipeline </w:t>
+      </w:r>
+      <w:r>
+        <w:t>–</w:t>
+      </w:r>
+      <w:r>
+        <w:t xml:space="preserve"> M2</w:t>
       </w:r>
     </w:p>
     <w:p>
@@ -185,7 +284,13 @@
         </w:numPr>
       </w:pPr>
       <w:r>
-        <w:t>Computer Vision Pipeline - M2</w:t>
+        <w:t xml:space="preserve">Computer Vision Pipeline </w:t>
+      </w:r>
+      <w:r>
+        <w:t>–</w:t>
+      </w:r>
+      <w:r>
+        <w:t xml:space="preserve"> M2</w:t>
       </w:r>
     </w:p>
     <w:p>
@@ -198,6 +303,88 @@
       </w:pPr>
       <w:r>
         <w:t>Masken verbessert</w:t>
+      </w:r>
+    </w:p>
+    <w:p>
+      <w:r>
+        <w:t>02.10.2026 – 17:00 bis 18:00 – 1 Std 0 Min</w:t>
+      </w:r>
+    </w:p>
+    <w:p>
+      <w:pPr>
+        <w:pStyle w:val="ListParagraph"/>
+        <w:numPr>
+          <w:ilvl w:val="0"/>
+          <w:numId w:val="1"/>
+        </w:numPr>
+      </w:pPr>
+      <w:r>
+        <w:t xml:space="preserve">Bilderfassungssystem </w:t>
+      </w:r>
+      <w:r>
+        <w:t>–</w:t>
+      </w:r>
+      <w:r>
+        <w:t xml:space="preserve"> M1</w:t>
+      </w:r>
+    </w:p>
+    <w:p>
+      <w:pPr>
+        <w:pStyle w:val="ListParagraph"/>
+        <w:numPr>
+          <w:ilvl w:val="0"/>
+          <w:numId w:val="1"/>
+        </w:numPr>
+      </w:pPr>
+      <w:r>
+        <w:t>Basil-Datenbanken recherche</w:t>
+      </w:r>
+    </w:p>
+    <w:p>
+      <w:r>
+        <w:t xml:space="preserve">03.10.2026 – 14:00 bis </w:t>
+      </w:r>
+      <w:r>
+        <w:t>17</w:t>
+      </w:r>
+      <w:r>
+        <w:t xml:space="preserve">:00 –  </w:t>
+      </w:r>
+      <w:r>
+        <w:t xml:space="preserve">3 </w:t>
+      </w:r>
+      <w:r>
+        <w:t>Std 0 Min</w:t>
+      </w:r>
+    </w:p>
+    <w:p>
+      <w:pPr>
+        <w:pStyle w:val="ListParagraph"/>
+        <w:numPr>
+          <w:ilvl w:val="0"/>
+          <w:numId w:val="1"/>
+        </w:numPr>
+      </w:pPr>
+      <w:r>
+        <w:t xml:space="preserve">Bilderfassungssystem </w:t>
+      </w:r>
+      <w:r>
+        <w:t>–</w:t>
+      </w:r>
+      <w:r>
+        <w:t xml:space="preserve"> M1</w:t>
+      </w:r>
+    </w:p>
+    <w:p>
+      <w:pPr>
+        <w:pStyle w:val="ListParagraph"/>
+        <w:numPr>
+          <w:ilvl w:val="0"/>
+          <w:numId w:val="1"/>
+        </w:numPr>
+      </w:pPr>
+      <w:r>
+        <w:t>Online Datenbank mit Python verbunden und getestet</w:t>
       </w:r>
     </w:p>
     <w:p/>

</xml_diff>

<commit_message>
Alle Python-Skripts zu eine zusammengefasst
</commit_message>
<xml_diff>
--- a/Stunden.docx
+++ b/Stunden.docx
@@ -21,7 +21,14 @@
           <w:b/>
           <w:bCs/>
         </w:rPr>
-        <w:t>30</w:t>
+        <w:t>3</w:t>
+      </w:r>
+      <w:r>
+        <w:rPr>
+          <w:b/>
+          <w:bCs/>
+        </w:rPr>
+        <w:t>8</w:t>
       </w:r>
       <w:r>
         <w:rPr>
@@ -635,22 +642,86 @@
     </w:p>
     <w:p>
       <w:r>
-        <w:t>2</w:t>
-      </w:r>
-      <w:r>
-        <w:t>2</w:t>
-      </w:r>
-      <w:r>
-        <w:t>.10.2026 – 1</w:t>
-      </w:r>
-      <w:r>
-        <w:t>6</w:t>
-      </w:r>
-      <w:r>
-        <w:t xml:space="preserve">:00 bis 20:00 – </w:t>
-      </w:r>
-      <w:r>
-        <w:t>2</w:t>
+        <w:t>22.10.2026 – 16:00 bis 20:00 – 2 Std 0 Min</w:t>
+      </w:r>
+    </w:p>
+    <w:p>
+      <w:pPr>
+        <w:pStyle w:val="ListParagraph"/>
+        <w:numPr>
+          <w:ilvl w:val="0"/>
+          <w:numId w:val="1"/>
+        </w:numPr>
+      </w:pPr>
+      <w:r>
+        <w:t xml:space="preserve">Bilderfassungssystem </w:t>
+      </w:r>
+      <w:r>
+        <w:t>–</w:t>
+      </w:r>
+      <w:r>
+        <w:t xml:space="preserve"> M1</w:t>
+      </w:r>
+    </w:p>
+    <w:p>
+      <w:pPr>
+        <w:pStyle w:val="ListParagraph"/>
+        <w:numPr>
+          <w:ilvl w:val="0"/>
+          <w:numId w:val="1"/>
+        </w:numPr>
+      </w:pPr>
+      <w:r>
+        <w:t>Verbindung mit Camera erstellen</w:t>
+      </w:r>
+    </w:p>
+    <w:p>
+      <w:r>
+        <w:t>24.10.2026 – 09:00 bis 12:00 – 3 Std 0 Min</w:t>
+      </w:r>
+    </w:p>
+    <w:p>
+      <w:pPr>
+        <w:pStyle w:val="ListParagraph"/>
+        <w:numPr>
+          <w:ilvl w:val="0"/>
+          <w:numId w:val="1"/>
+        </w:numPr>
+      </w:pPr>
+      <w:r>
+        <w:t xml:space="preserve">Computer Vision Pipeline </w:t>
+      </w:r>
+      <w:r>
+        <w:t>–</w:t>
+      </w:r>
+      <w:r>
+        <w:t xml:space="preserve"> M2</w:t>
+      </w:r>
+    </w:p>
+    <w:p>
+      <w:pPr>
+        <w:pStyle w:val="ListParagraph"/>
+        <w:numPr>
+          <w:ilvl w:val="0"/>
+          <w:numId w:val="1"/>
+        </w:numPr>
+      </w:pPr>
+      <w:r>
+        <w:t>Kontrolle- und Maskebilder vereinfacht und verbessert</w:t>
+      </w:r>
+    </w:p>
+    <w:p>
+      <w:r>
+        <w:t xml:space="preserve">24.10.2026 – 15:00 bis </w:t>
+      </w:r>
+      <w:r>
+        <w:t>20</w:t>
+      </w:r>
+      <w:r>
+        <w:t xml:space="preserve">:00 – </w:t>
+      </w:r>
+      <w:r>
+        <w:t>5</w:t>
       </w:r>
       <w:r>
         <w:t xml:space="preserve"> Std 0 Min</w:t>
@@ -665,13 +736,13 @@
         </w:numPr>
       </w:pPr>
       <w:r>
-        <w:t xml:space="preserve">Bilderfassungssystem </w:t>
-      </w:r>
-      <w:r>
-        <w:t>–</w:t>
-      </w:r>
-      <w:r>
-        <w:t xml:space="preserve"> M1</w:t>
+        <w:t xml:space="preserve">Computer Vision Pipeline </w:t>
+      </w:r>
+      <w:r>
+        <w:t>–</w:t>
+      </w:r>
+      <w:r>
+        <w:t xml:space="preserve"> M2</w:t>
       </w:r>
     </w:p>
     <w:p>
@@ -683,8 +754,13 @@
         </w:numPr>
       </w:pPr>
       <w:r>
-        <w:t>Verbindung mit Camera erstellen</w:t>
-      </w:r>
+        <w:t>Kontrolle- und Maskebilder vereinfacht und verbessert</w:t>
+      </w:r>
+    </w:p>
+    <w:p>
+      <w:pPr>
+        <w:pStyle w:val="ListParagraph"/>
+      </w:pPr>
     </w:p>
     <w:sectPr>
       <w:headerReference w:type="default" r:id="rId8"/>

</xml_diff>

<commit_message>
Blattmaske auf CIELAB a* umstellen, Wachstumsrate und Score korrigieren
</commit_message>
<xml_diff>
--- a/Stunden.docx
+++ b/Stunden.docx
@@ -21,14 +21,7 @@
           <w:b/>
           <w:bCs/>
         </w:rPr>
-        <w:t>4</w:t>
-      </w:r>
-      <w:r>
-        <w:rPr>
-          <w:b/>
-          <w:bCs/>
-        </w:rPr>
-        <w:t>7</w:t>
+        <w:t>50</w:t>
       </w:r>
       <w:r>
         <w:rPr>
@@ -830,33 +823,102 @@
     </w:p>
     <w:p>
       <w:r>
+        <w:t xml:space="preserve">28.10.2026 </w:t>
+      </w:r>
+      <w:r>
+        <w:t>– 17:00 bis 20:00 – 3 Std 0 Min</w:t>
+      </w:r>
+    </w:p>
+    <w:p>
+      <w:pPr>
+        <w:pStyle w:val="ListParagraph"/>
+        <w:numPr>
+          <w:ilvl w:val="0"/>
+          <w:numId w:val="8"/>
+        </w:numPr>
+      </w:pPr>
+      <w:r>
+        <w:t xml:space="preserve">Computer Vision Pipeline </w:t>
+      </w:r>
+      <w:r>
+        <w:t>–</w:t>
+      </w:r>
+      <w:r>
+        <w:t xml:space="preserve"> M2</w:t>
+      </w:r>
+    </w:p>
+    <w:p>
+      <w:pPr>
+        <w:pStyle w:val="ListParagraph"/>
+        <w:numPr>
+          <w:ilvl w:val="0"/>
+          <w:numId w:val="8"/>
+        </w:numPr>
+      </w:pPr>
+      <w:r>
+        <w:t>Kontrolle- und Maskebilder vereinfacht und verbessert</w:t>
+      </w:r>
+    </w:p>
+    <w:p>
+      <w:r>
         <w:t>2</w:t>
       </w:r>
       <w:r>
-        <w:t>8</w:t>
-      </w:r>
-      <w:r>
-        <w:t>.10.2026 – 1</w:t>
-      </w:r>
-      <w:r>
-        <w:t>7</w:t>
-      </w:r>
-      <w:r>
-        <w:t xml:space="preserve">:00 bis 20:00 – </w:t>
-      </w:r>
-      <w:r>
-        <w:t>3</w:t>
-      </w:r>
-      <w:r>
-        <w:t xml:space="preserve"> Std 0 Min</w:t>
-      </w:r>
-    </w:p>
-    <w:p>
-      <w:pPr>
-        <w:pStyle w:val="ListParagraph"/>
-        <w:numPr>
-          <w:ilvl w:val="0"/>
-          <w:numId w:val="2"/>
+        <w:t>9</w:t>
+      </w:r>
+      <w:r>
+        <w:t xml:space="preserve">.10.2026 – </w:t>
+      </w:r>
+      <w:r>
+        <w:t>18</w:t>
+      </w:r>
+      <w:r>
+        <w:t>:00 bis 2</w:t>
+      </w:r>
+      <w:r>
+        <w:t>1</w:t>
+      </w:r>
+      <w:r>
+        <w:t>:00 – 3 Std 0 Min</w:t>
+      </w:r>
+    </w:p>
+    <w:p>
+      <w:pPr>
+        <w:pStyle w:val="ListParagraph"/>
+        <w:numPr>
+          <w:ilvl w:val="0"/>
+          <w:numId w:val="8"/>
+        </w:numPr>
+      </w:pPr>
+      <w:r>
+        <w:t xml:space="preserve">Computer Vision Pipeline </w:t>
+      </w:r>
+      <w:r>
+        <w:t>–</w:t>
+      </w:r>
+      <w:r>
+        <w:t xml:space="preserve"> M2</w:t>
+      </w:r>
+    </w:p>
+    <w:p>
+      <w:pPr>
+        <w:pStyle w:val="ListParagraph"/>
+        <w:numPr>
+          <w:ilvl w:val="0"/>
+          <w:numId w:val="8"/>
+        </w:numPr>
+      </w:pPr>
+      <w:r>
+        <w:t>Kontrolle- und Maskebilder vereinfacht und verbessert</w:t>
+      </w:r>
+    </w:p>
+    <w:p/>
+    <w:p>
+      <w:pPr>
+        <w:pStyle w:val="ListParagraph"/>
+        <w:numPr>
+          <w:ilvl w:val="0"/>
+          <w:numId w:val="8"/>
         </w:numPr>
       </w:pPr>
       <w:r>
@@ -959,6 +1021,232 @@
 <file path=word/numbering.xml><?xml version="1.0" encoding="utf-8"?>
 <w:numbering xmlns:wpc="http://schemas.microsoft.com/office/word/2010/wordprocessingCanvas" xmlns:cx="http://schemas.microsoft.com/office/drawing/2014/chartex" xmlns:cx1="http://schemas.microsoft.com/office/drawing/2015/9/8/chartex" xmlns:cx2="http://schemas.microsoft.com/office/drawing/2015/10/21/chartex" xmlns:cx3="http://schemas.microsoft.com/office/drawing/2016/5/9/chartex" xmlns:cx4="http://schemas.microsoft.com/office/drawing/2016/5/10/chartex" xmlns:cx5="http://schemas.microsoft.com/office/drawing/2016/5/11/chartex" xmlns:cx6="http://schemas.microsoft.com/office/drawing/2016/5/12/chartex" xmlns:cx7="http://schemas.microsoft.com/office/drawing/2016/5/13/chartex" xmlns:cx8="http://schemas.microsoft.com/office/drawing/2016/5/14/chartex" xmlns:mc="http://schemas.openxmlformats.org/markup-compatibility/2006" xmlns:aink="http://schemas.microsoft.com/office/drawing/2016/ink" xmlns:am3d="http://schemas.microsoft.com/office/drawing/2017/model3d" xmlns:o="urn:schemas-microsoft-com:office:office" xmlns:oel="http://schemas.microsoft.com/office/2019/extlst" xmlns:r="http://schemas.openxmlformats.org/officeDocument/2006/relationships" xmlns:m="http://schemas.openxmlformats.org/officeDocument/2006/math" xmlns:v="urn:schemas-microsoft-com:vml" xmlns:wp14="http://schemas.microsoft.com/office/word/2010/wordprocessingDrawing" xmlns:wp="http://schemas.openxmlformats.org/drawingml/2006/wordprocessingDrawing" xmlns:w10="urn:schemas-microsoft-com:office:word" xmlns:w="http://schemas.openxmlformats.org/wordprocessingml/2006/main" xmlns:w14="http://schemas.microsoft.com/office/word/2010/wordml" xmlns:w15="http://schemas.microsoft.com/office/word/2012/wordml" xmlns:w16cex="http://schemas.microsoft.com/office/word/2018/wordml/cex" xmlns:w16cid="http://schemas.microsoft.com/office/word/2016/wordml/cid" xmlns:w16="http://schemas.microsoft.com/office/word/2018/wordml" xmlns:w16du="http://schemas.microsoft.com/office/word/2023/wordml/word16du" xmlns:w16sdtdh="http://schemas.microsoft.com/office/word/2020/wordml/sdtdatahash" xmlns:w16sdtfl="http://schemas.microsoft.com/office/word/2024/wordml/sdtformatlock" xmlns:w16se="http://schemas.microsoft.com/office/word/2015/wordml/symex" xmlns:wpg="http://schemas.microsoft.com/office/word/2010/wordprocessingGroup" xmlns:wpi="http://schemas.microsoft.com/office/word/2010/wordprocessingInk" xmlns:wne="http://schemas.microsoft.com/office/word/2006/wordml" xmlns:wps="http://schemas.microsoft.com/office/word/2010/wordprocessingShape" mc:Ignorable="w14 w15 w16se w16cid w16 w16cex w16sdtdh w16sdtfl w16du wp14">
   <w:abstractNum w:abstractNumId="0" w15:restartNumberingAfterBreak="0">
+    <w:nsid w:val="14163F48"/>
+    <w:multiLevelType w:val="multilevel"/>
+    <w:tmpl w:val="D67A9506"/>
+    <w:lvl w:ilvl="0">
+      <w:start w:val="29"/>
+      <w:numFmt w:val="decimal"/>
+      <w:lvlText w:val="%1"/>
+      <w:lvlJc w:val="left"/>
+      <w:pPr>
+        <w:ind w:left="1200" w:hanging="1200"/>
+      </w:pPr>
+      <w:rPr>
+        <w:rFonts w:hint="default"/>
+      </w:rPr>
+    </w:lvl>
+    <w:lvl w:ilvl="1">
+      <w:start w:val="10"/>
+      <w:numFmt w:val="decimal"/>
+      <w:lvlText w:val="%1.%2"/>
+      <w:lvlJc w:val="left"/>
+      <w:pPr>
+        <w:ind w:left="1200" w:hanging="1200"/>
+      </w:pPr>
+      <w:rPr>
+        <w:rFonts w:hint="default"/>
+      </w:rPr>
+    </w:lvl>
+    <w:lvl w:ilvl="2">
+      <w:start w:val="2026"/>
+      <w:numFmt w:val="decimal"/>
+      <w:lvlText w:val="%1.%2.%3"/>
+      <w:lvlJc w:val="left"/>
+      <w:pPr>
+        <w:ind w:left="1200" w:hanging="1200"/>
+      </w:pPr>
+      <w:rPr>
+        <w:rFonts w:hint="default"/>
+      </w:rPr>
+    </w:lvl>
+    <w:lvl w:ilvl="3">
+      <w:start w:val="1"/>
+      <w:numFmt w:val="decimal"/>
+      <w:lvlText w:val="%1.%2.%3.%4"/>
+      <w:lvlJc w:val="left"/>
+      <w:pPr>
+        <w:ind w:left="1200" w:hanging="1200"/>
+      </w:pPr>
+      <w:rPr>
+        <w:rFonts w:hint="default"/>
+      </w:rPr>
+    </w:lvl>
+    <w:lvl w:ilvl="4">
+      <w:start w:val="1"/>
+      <w:numFmt w:val="decimal"/>
+      <w:lvlText w:val="%1.%2.%3.%4.%5"/>
+      <w:lvlJc w:val="left"/>
+      <w:pPr>
+        <w:ind w:left="1200" w:hanging="1200"/>
+      </w:pPr>
+      <w:rPr>
+        <w:rFonts w:hint="default"/>
+      </w:rPr>
+    </w:lvl>
+    <w:lvl w:ilvl="5">
+      <w:start w:val="1"/>
+      <w:numFmt w:val="decimal"/>
+      <w:lvlText w:val="%1.%2.%3.%4.%5.%6"/>
+      <w:lvlJc w:val="left"/>
+      <w:pPr>
+        <w:ind w:left="1440" w:hanging="1440"/>
+      </w:pPr>
+      <w:rPr>
+        <w:rFonts w:hint="default"/>
+      </w:rPr>
+    </w:lvl>
+    <w:lvl w:ilvl="6">
+      <w:start w:val="1"/>
+      <w:numFmt w:val="decimal"/>
+      <w:lvlText w:val="%1.%2.%3.%4.%5.%6.%7"/>
+      <w:lvlJc w:val="left"/>
+      <w:pPr>
+        <w:ind w:left="1440" w:hanging="1440"/>
+      </w:pPr>
+      <w:rPr>
+        <w:rFonts w:hint="default"/>
+      </w:rPr>
+    </w:lvl>
+    <w:lvl w:ilvl="7">
+      <w:start w:val="1"/>
+      <w:numFmt w:val="decimal"/>
+      <w:lvlText w:val="%1.%2.%3.%4.%5.%6.%7.%8"/>
+      <w:lvlJc w:val="left"/>
+      <w:pPr>
+        <w:ind w:left="1800" w:hanging="1800"/>
+      </w:pPr>
+      <w:rPr>
+        <w:rFonts w:hint="default"/>
+      </w:rPr>
+    </w:lvl>
+    <w:lvl w:ilvl="8">
+      <w:start w:val="1"/>
+      <w:numFmt w:val="decimal"/>
+      <w:lvlText w:val="%1.%2.%3.%4.%5.%6.%7.%8.%9"/>
+      <w:lvlJc w:val="left"/>
+      <w:pPr>
+        <w:ind w:left="1800" w:hanging="1800"/>
+      </w:pPr>
+      <w:rPr>
+        <w:rFonts w:hint="default"/>
+      </w:rPr>
+    </w:lvl>
+  </w:abstractNum>
+  <w:abstractNum w:abstractNumId="1" w15:restartNumberingAfterBreak="0">
+    <w:nsid w:val="147B5706"/>
+    <w:multiLevelType w:val="hybridMultilevel"/>
+    <w:tmpl w:val="A36E6126"/>
+    <w:lvl w:ilvl="0" w:tplc="04090001">
+      <w:start w:val="1"/>
+      <w:numFmt w:val="bullet"/>
+      <w:lvlText w:val=""/>
+      <w:lvlJc w:val="left"/>
+      <w:pPr>
+        <w:ind w:left="720" w:hanging="360"/>
+      </w:pPr>
+      <w:rPr>
+        <w:rFonts w:ascii="Symbol" w:hAnsi="Symbol" w:hint="default"/>
+      </w:rPr>
+    </w:lvl>
+    <w:lvl w:ilvl="1" w:tplc="04090003" w:tentative="1">
+      <w:start w:val="1"/>
+      <w:numFmt w:val="bullet"/>
+      <w:lvlText w:val="o"/>
+      <w:lvlJc w:val="left"/>
+      <w:pPr>
+        <w:ind w:left="1440" w:hanging="360"/>
+      </w:pPr>
+      <w:rPr>
+        <w:rFonts w:ascii="Courier New" w:hAnsi="Courier New" w:cs="Courier New" w:hint="default"/>
+      </w:rPr>
+    </w:lvl>
+    <w:lvl w:ilvl="2" w:tplc="04090005" w:tentative="1">
+      <w:start w:val="1"/>
+      <w:numFmt w:val="bullet"/>
+      <w:lvlText w:val=""/>
+      <w:lvlJc w:val="left"/>
+      <w:pPr>
+        <w:ind w:left="2160" w:hanging="360"/>
+      </w:pPr>
+      <w:rPr>
+        <w:rFonts w:ascii="Wingdings" w:hAnsi="Wingdings" w:hint="default"/>
+      </w:rPr>
+    </w:lvl>
+    <w:lvl w:ilvl="3" w:tplc="04090001" w:tentative="1">
+      <w:start w:val="1"/>
+      <w:numFmt w:val="bullet"/>
+      <w:lvlText w:val=""/>
+      <w:lvlJc w:val="left"/>
+      <w:pPr>
+        <w:ind w:left="2880" w:hanging="360"/>
+      </w:pPr>
+      <w:rPr>
+        <w:rFonts w:ascii="Symbol" w:hAnsi="Symbol" w:hint="default"/>
+      </w:rPr>
+    </w:lvl>
+    <w:lvl w:ilvl="4" w:tplc="04090003" w:tentative="1">
+      <w:start w:val="1"/>
+      <w:numFmt w:val="bullet"/>
+      <w:lvlText w:val="o"/>
+      <w:lvlJc w:val="left"/>
+      <w:pPr>
+        <w:ind w:left="3600" w:hanging="360"/>
+      </w:pPr>
+      <w:rPr>
+        <w:rFonts w:ascii="Courier New" w:hAnsi="Courier New" w:cs="Courier New" w:hint="default"/>
+      </w:rPr>
+    </w:lvl>
+    <w:lvl w:ilvl="5" w:tplc="04090005" w:tentative="1">
+      <w:start w:val="1"/>
+      <w:numFmt w:val="bullet"/>
+      <w:lvlText w:val=""/>
+      <w:lvlJc w:val="left"/>
+      <w:pPr>
+        <w:ind w:left="4320" w:hanging="360"/>
+      </w:pPr>
+      <w:rPr>
+        <w:rFonts w:ascii="Wingdings" w:hAnsi="Wingdings" w:hint="default"/>
+      </w:rPr>
+    </w:lvl>
+    <w:lvl w:ilvl="6" w:tplc="04090001" w:tentative="1">
+      <w:start w:val="1"/>
+      <w:numFmt w:val="bullet"/>
+      <w:lvlText w:val=""/>
+      <w:lvlJc w:val="left"/>
+      <w:pPr>
+        <w:ind w:left="5040" w:hanging="360"/>
+      </w:pPr>
+      <w:rPr>
+        <w:rFonts w:ascii="Symbol" w:hAnsi="Symbol" w:hint="default"/>
+      </w:rPr>
+    </w:lvl>
+    <w:lvl w:ilvl="7" w:tplc="04090003" w:tentative="1">
+      <w:start w:val="1"/>
+      <w:numFmt w:val="bullet"/>
+      <w:lvlText w:val="o"/>
+      <w:lvlJc w:val="left"/>
+      <w:pPr>
+        <w:ind w:left="5760" w:hanging="360"/>
+      </w:pPr>
+      <w:rPr>
+        <w:rFonts w:ascii="Courier New" w:hAnsi="Courier New" w:cs="Courier New" w:hint="default"/>
+      </w:rPr>
+    </w:lvl>
+    <w:lvl w:ilvl="8" w:tplc="04090005" w:tentative="1">
+      <w:start w:val="1"/>
+      <w:numFmt w:val="bullet"/>
+      <w:lvlText w:val=""/>
+      <w:lvlJc w:val="left"/>
+      <w:pPr>
+        <w:ind w:left="6480" w:hanging="360"/>
+      </w:pPr>
+      <w:rPr>
+        <w:rFonts w:ascii="Wingdings" w:hAnsi="Wingdings" w:hint="default"/>
+      </w:rPr>
+    </w:lvl>
+  </w:abstractNum>
+  <w:abstractNum w:abstractNumId="2" w15:restartNumberingAfterBreak="0">
     <w:nsid w:val="34880AE6"/>
     <w:multiLevelType w:val="hybridMultilevel"/>
     <w:tmpl w:val="289A225A"/>
@@ -1071,7 +1359,7 @@
       </w:rPr>
     </w:lvl>
   </w:abstractNum>
-  <w:abstractNum w:abstractNumId="1" w15:restartNumberingAfterBreak="0">
+  <w:abstractNum w:abstractNumId="3" w15:restartNumberingAfterBreak="0">
     <w:nsid w:val="38525AEF"/>
     <w:multiLevelType w:val="hybridMultilevel"/>
     <w:tmpl w:val="A854091C"/>
@@ -1184,7 +1472,120 @@
       </w:rPr>
     </w:lvl>
   </w:abstractNum>
-  <w:abstractNum w:abstractNumId="2" w15:restartNumberingAfterBreak="0">
+  <w:abstractNum w:abstractNumId="4" w15:restartNumberingAfterBreak="0">
+    <w:nsid w:val="390B10A4"/>
+    <w:multiLevelType w:val="multilevel"/>
+    <w:tmpl w:val="1ABAC11C"/>
+    <w:lvl w:ilvl="0">
+      <w:start w:val="28"/>
+      <w:numFmt w:val="decimal"/>
+      <w:lvlText w:val="%1"/>
+      <w:lvlJc w:val="left"/>
+      <w:pPr>
+        <w:ind w:left="1200" w:hanging="1200"/>
+      </w:pPr>
+      <w:rPr>
+        <w:rFonts w:hint="default"/>
+      </w:rPr>
+    </w:lvl>
+    <w:lvl w:ilvl="1">
+      <w:start w:val="10"/>
+      <w:numFmt w:val="decimal"/>
+      <w:lvlText w:val="%1.%2"/>
+      <w:lvlJc w:val="left"/>
+      <w:pPr>
+        <w:ind w:left="1200" w:hanging="1200"/>
+      </w:pPr>
+      <w:rPr>
+        <w:rFonts w:hint="default"/>
+      </w:rPr>
+    </w:lvl>
+    <w:lvl w:ilvl="2">
+      <w:start w:val="2026"/>
+      <w:numFmt w:val="decimal"/>
+      <w:lvlText w:val="%1.%2.%3"/>
+      <w:lvlJc w:val="left"/>
+      <w:pPr>
+        <w:ind w:left="1200" w:hanging="1200"/>
+      </w:pPr>
+      <w:rPr>
+        <w:rFonts w:hint="default"/>
+      </w:rPr>
+    </w:lvl>
+    <w:lvl w:ilvl="3">
+      <w:start w:val="1"/>
+      <w:numFmt w:val="decimal"/>
+      <w:lvlText w:val="%1.%2.%3.%4"/>
+      <w:lvlJc w:val="left"/>
+      <w:pPr>
+        <w:ind w:left="1200" w:hanging="1200"/>
+      </w:pPr>
+      <w:rPr>
+        <w:rFonts w:hint="default"/>
+      </w:rPr>
+    </w:lvl>
+    <w:lvl w:ilvl="4">
+      <w:start w:val="1"/>
+      <w:numFmt w:val="decimal"/>
+      <w:lvlText w:val="%1.%2.%3.%4.%5"/>
+      <w:lvlJc w:val="left"/>
+      <w:pPr>
+        <w:ind w:left="1200" w:hanging="1200"/>
+      </w:pPr>
+      <w:rPr>
+        <w:rFonts w:hint="default"/>
+      </w:rPr>
+    </w:lvl>
+    <w:lvl w:ilvl="5">
+      <w:start w:val="1"/>
+      <w:numFmt w:val="decimal"/>
+      <w:lvlText w:val="%1.%2.%3.%4.%5.%6"/>
+      <w:lvlJc w:val="left"/>
+      <w:pPr>
+        <w:ind w:left="1440" w:hanging="1440"/>
+      </w:pPr>
+      <w:rPr>
+        <w:rFonts w:hint="default"/>
+      </w:rPr>
+    </w:lvl>
+    <w:lvl w:ilvl="6">
+      <w:start w:val="1"/>
+      <w:numFmt w:val="decimal"/>
+      <w:lvlText w:val="%1.%2.%3.%4.%5.%6.%7"/>
+      <w:lvlJc w:val="left"/>
+      <w:pPr>
+        <w:ind w:left="1440" w:hanging="1440"/>
+      </w:pPr>
+      <w:rPr>
+        <w:rFonts w:hint="default"/>
+      </w:rPr>
+    </w:lvl>
+    <w:lvl w:ilvl="7">
+      <w:start w:val="1"/>
+      <w:numFmt w:val="decimal"/>
+      <w:lvlText w:val="%1.%2.%3.%4.%5.%6.%7.%8"/>
+      <w:lvlJc w:val="left"/>
+      <w:pPr>
+        <w:ind w:left="1800" w:hanging="1800"/>
+      </w:pPr>
+      <w:rPr>
+        <w:rFonts w:hint="default"/>
+      </w:rPr>
+    </w:lvl>
+    <w:lvl w:ilvl="8">
+      <w:start w:val="1"/>
+      <w:numFmt w:val="decimal"/>
+      <w:lvlText w:val="%1.%2.%3.%4.%5.%6.%7.%8.%9"/>
+      <w:lvlJc w:val="left"/>
+      <w:pPr>
+        <w:ind w:left="1800" w:hanging="1800"/>
+      </w:pPr>
+      <w:rPr>
+        <w:rFonts w:hint="default"/>
+      </w:rPr>
+    </w:lvl>
+  </w:abstractNum>
+  <w:abstractNum w:abstractNumId="5" w15:restartNumberingAfterBreak="0">
     <w:nsid w:val="3B086F34"/>
     <w:multiLevelType w:val="hybridMultilevel"/>
     <w:tmpl w:val="582E6A48"/>
@@ -1297,7 +1698,7 @@
       </w:rPr>
     </w:lvl>
   </w:abstractNum>
-  <w:abstractNum w:abstractNumId="3" w15:restartNumberingAfterBreak="0">
+  <w:abstractNum w:abstractNumId="6" w15:restartNumberingAfterBreak="0">
     <w:nsid w:val="570D52D6"/>
     <w:multiLevelType w:val="hybridMultilevel"/>
     <w:tmpl w:val="F02AFF24"/>
@@ -1410,7 +1811,7 @@
       </w:rPr>
     </w:lvl>
   </w:abstractNum>
-  <w:abstractNum w:abstractNumId="4" w15:restartNumberingAfterBreak="0">
+  <w:abstractNum w:abstractNumId="7" w15:restartNumberingAfterBreak="0">
     <w:nsid w:val="5D2071DD"/>
     <w:multiLevelType w:val="hybridMultilevel"/>
     <w:tmpl w:val="FE8619E0"/>
@@ -1523,7 +1924,7 @@
       </w:rPr>
     </w:lvl>
   </w:abstractNum>
-  <w:abstractNum w:abstractNumId="5" w15:restartNumberingAfterBreak="0">
+  <w:abstractNum w:abstractNumId="8" w15:restartNumberingAfterBreak="0">
     <w:nsid w:val="6F251CAB"/>
     <w:multiLevelType w:val="hybridMultilevel"/>
     <w:tmpl w:val="DFA410AA"/>
@@ -1637,22 +2038,31 @@
     </w:lvl>
   </w:abstractNum>
   <w:num w:numId="1" w16cid:durableId="1577521007">
+    <w:abstractNumId w:val="6"/>
+  </w:num>
+  <w:num w:numId="2" w16cid:durableId="597520375">
     <w:abstractNumId w:val="3"/>
   </w:num>
-  <w:num w:numId="2" w16cid:durableId="597520375">
+  <w:num w:numId="3" w16cid:durableId="545994432">
+    <w:abstractNumId w:val="2"/>
+  </w:num>
+  <w:num w:numId="4" w16cid:durableId="959531327">
+    <w:abstractNumId w:val="5"/>
+  </w:num>
+  <w:num w:numId="5" w16cid:durableId="1325939017">
+    <w:abstractNumId w:val="7"/>
+  </w:num>
+  <w:num w:numId="6" w16cid:durableId="1544101672">
+    <w:abstractNumId w:val="8"/>
+  </w:num>
+  <w:num w:numId="7" w16cid:durableId="1997226876">
+    <w:abstractNumId w:val="4"/>
+  </w:num>
+  <w:num w:numId="8" w16cid:durableId="796029683">
     <w:abstractNumId w:val="1"/>
   </w:num>
-  <w:num w:numId="3" w16cid:durableId="545994432">
+  <w:num w:numId="9" w16cid:durableId="1169633087">
     <w:abstractNumId w:val="0"/>
-  </w:num>
-  <w:num w:numId="4" w16cid:durableId="959531327">
-    <w:abstractNumId w:val="2"/>
-  </w:num>
-  <w:num w:numId="5" w16cid:durableId="1325939017">
-    <w:abstractNumId w:val="4"/>
-  </w:num>
-  <w:num w:numId="6" w16cid:durableId="1544101672">
-    <w:abstractNumId w:val="5"/>
   </w:num>
 </w:numbering>
 </file>
@@ -2263,6 +2673,7 @@
   <w:style w:type="character" w:default="1" w:styleId="DefaultParagraphFont">
     <w:name w:val="Default Paragraph Font"/>
     <w:uiPriority w:val="1"/>
+    <w:semiHidden/>
     <w:unhideWhenUsed/>
   </w:style>
   <w:style w:type="table" w:default="1" w:styleId="TableNormal">

</xml_diff>